<commit_message>
deck and handouts: backup wording generic (Azure Backup or a partner product); design charts in bottom-up order
</commit_message>
<xml_diff>
--- a/handouts/Azure_Local_Lifecycle_Guide.docx
+++ b/handouts/Azure_Local_Lifecycle_Guide.docx
@@ -3729,16 +3729,16 @@
                 <w:sz w:val="18"/>
                 <w:szCs w:val="18"/>
               </w:rPr>
-              <w:t>Monitoring: Insights with a DCR sized to the cost ceiling, alert rules and an action group, VM Insights on the workload VMs. Updates: Azure Update Manager maintenance configuration; Lifecycle Manager for the cluster, Update Manager for guests, Intune for Windows 11. Protection: backup (Azure Backup Server or a partner product for Azure Local VMs) and Site Recovery with a test failover. Access: RBAC with Entra PIM, eligible not standing. Governance: Defender for Cloud and the Azure Policy baseline. The readi</w:t>
-            </w:r>
-            <w:r>
-              <w:rPr>
-                <w:rFonts w:ascii="Segoe UI" w:eastAsia="Times New Roman" w:hAnsi="Segoe UI" w:cs="Segoe UI"/>
-                <w:color w:val="1B2430"/>
-                <w:sz w:val="18"/>
-                <w:szCs w:val="18"/>
-              </w:rPr>
-              <w:t>ness gate: every control Verified with evidence, then the hand-off to the ops team (runbook, as-built package, alert routes, maintenance window).</w:t>
+              <w:t>Monitoring: Insights with a DCR sized to the cost ceiling, alert rules and an action group, VM Insights on the workload VMs. Updates: Azure Update Manager maintenance configuration; Lifecycle Manager for the cluster, Update Manager for guests, Intune for Windows 11. Protection: backup (Azure Backup or a partner product such as Veeam, Commvault, Cohesity or Rubrik for Azure Local VMs) and Site Recovery with a test failover. Access: RBAC with Entra PIM, eligible not standing. Governance: Defender for Cloud an</w:t>
+            </w:r>
+            <w:r>
+              <w:rPr>
+                <w:rFonts w:ascii="Segoe UI" w:eastAsia="Times New Roman" w:hAnsi="Segoe UI" w:cs="Segoe UI"/>
+                <w:color w:val="1B2430"/>
+                <w:sz w:val="18"/>
+                <w:szCs w:val="18"/>
+              </w:rPr>
+              <w:t>d the Azure Policy baseline. The readiness gate: every control Verified with evidence, then the hand-off to the ops team (runbook, as-built package, alert routes, maintenance window).</w:t>
             </w:r>
           </w:p>
         </w:tc>
@@ -3862,7 +3862,7 @@
                 <w:sz w:val="18"/>
                 <w:szCs w:val="18"/>
               </w:rPr>
-              <w:t>Azure Backup Server</w:t>
+              <w:t>backup options for Azure Local VMs</w:t>
             </w:r>
             <w:r>
               <w:rPr>
@@ -5324,9 +5324,9 @@
 <file path=word/numbering.xml><?xml version="1.0" encoding="utf-8"?>
 <w:numbering xmlns:wpc="http://schemas.microsoft.com/office/word/2010/wordprocessingCanvas" xmlns:cx="http://schemas.microsoft.com/office/drawing/2014/chartex" xmlns:cx1="http://schemas.microsoft.com/office/drawing/2015/9/8/chartex" xmlns:cx2="http://schemas.microsoft.com/office/drawing/2015/10/21/chartex" xmlns:cx3="http://schemas.microsoft.com/office/drawing/2016/5/9/chartex" xmlns:cx4="http://schemas.microsoft.com/office/drawing/2016/5/10/chartex" xmlns:cx5="http://schemas.microsoft.com/office/drawing/2016/5/11/chartex" xmlns:cx6="http://schemas.microsoft.com/office/drawing/2016/5/12/chartex" xmlns:cx7="http://schemas.microsoft.com/office/drawing/2016/5/13/chartex" xmlns:cx8="http://schemas.microsoft.com/office/drawing/2016/5/14/chartex" xmlns:mc="http://schemas.openxmlformats.org/markup-compatibility/2006" xmlns:aink="http://schemas.microsoft.com/office/drawing/2016/ink" xmlns:am3d="http://schemas.microsoft.com/office/drawing/2017/model3d" xmlns:o="urn:schemas-microsoft-com:office:office" xmlns:oel="http://schemas.microsoft.com/office/2019/extlst" xmlns:r="http://schemas.openxmlformats.org/officeDocument/2006/relationships" xmlns:m="http://schemas.openxmlformats.org/officeDocument/2006/math" xmlns:v="urn:schemas-microsoft-com:vml" xmlns:wp14="http://schemas.microsoft.com/office/word/2010/wordprocessingDrawing" xmlns:wp="http://schemas.openxmlformats.org/drawingml/2006/wordprocessingDrawing" xmlns:w10="urn:schemas-microsoft-com:office:word" xmlns:w="http://schemas.openxmlformats.org/wordprocessingml/2006/main" xmlns:w14="http://schemas.microsoft.com/office/word/2010/wordml" xmlns:w15="http://schemas.microsoft.com/office/word/2012/wordml" xmlns:w16cex="http://schemas.microsoft.com/office/word/2018/wordml/cex" xmlns:w16cid="http://schemas.microsoft.com/office/word/2016/wordml/cid" xmlns:w16="http://schemas.microsoft.com/office/word/2018/wordml" xmlns:w16du="http://schemas.microsoft.com/office/word/2023/wordml/word16du" xmlns:w16sdtdh="http://schemas.microsoft.com/office/word/2020/wordml/sdtdatahash" xmlns:w16sdtfl="http://schemas.microsoft.com/office/word/2024/wordml/sdtformatlock" xmlns:w16se="http://schemas.microsoft.com/office/word/2015/wordml/symex" xmlns:wpg="http://schemas.microsoft.com/office/word/2010/wordprocessingGroup" xmlns:wpi="http://schemas.microsoft.com/office/word/2010/wordprocessingInk" xmlns:wne="http://schemas.microsoft.com/office/word/2006/wordml" xmlns:wps="http://schemas.microsoft.com/office/word/2010/wordprocessingShape" mc:Ignorable="w14 w15 w16se w16cid w16 w16cex w16sdtdh w16sdtfl w16du wp14">
   <w:abstractNum w:abstractNumId="0" w15:restartNumberingAfterBreak="0">
-    <w:nsid w:val="27A35A01"/>
+    <w:nsid w:val="61FE2493"/>
     <w:multiLevelType w:val="multilevel"/>
-    <w:tmpl w:val="3B42E0C2"/>
+    <w:tmpl w:val="8BB424E2"/>
     <w:lvl w:ilvl="0">
       <w:start w:val="1"/>
       <w:numFmt w:val="bullet"/>
@@ -5473,9 +5473,9 @@
     </w:lvl>
   </w:abstractNum>
   <w:abstractNum w:abstractNumId="1" w15:restartNumberingAfterBreak="0">
-    <w:nsid w:val="5C240A4E"/>
+    <w:nsid w:val="66D82AD7"/>
     <w:multiLevelType w:val="multilevel"/>
-    <w:tmpl w:val="2F146B94"/>
+    <w:tmpl w:val="E632C49C"/>
     <w:lvl w:ilvl="0">
       <w:start w:val="1"/>
       <w:numFmt w:val="bullet"/>
@@ -5621,10 +5621,10 @@
       </w:rPr>
     </w:lvl>
   </w:abstractNum>
-  <w:num w:numId="1" w16cid:durableId="982849050">
+  <w:num w:numId="1" w16cid:durableId="561408412">
     <w:abstractNumId w:val="1"/>
   </w:num>
-  <w:num w:numId="2" w16cid:durableId="2095591667">
+  <w:num w:numId="2" w16cid:durableId="707920380">
     <w:abstractNumId w:val="0"/>
   </w:num>
 </w:numbering>

</xml_diff>